<commit_message>
Add Day 07 prompt engineering materials
</commit_message>
<xml_diff>
--- a/Day07/Notes/Prompt Engineering.docx
+++ b/Day07/Notes/Prompt Engineering.docx
@@ -6,12 +6,16 @@
       <w:pPr>
         <w:rPr>
           <w:rFonts w:hint="default"/>
-          <w:lang w:val="en-US"/>
-        </w:rPr>
-      </w:pPr>
-      <w:r>
-        <w:rPr>
-          <w:rFonts w:hint="default"/>
+          <w:b/>
+          <w:bCs/>
+          <w:lang w:val="en-US"/>
+        </w:rPr>
+      </w:pPr>
+      <w:r>
+        <w:rPr>
+          <w:rFonts w:hint="default"/>
+          <w:b/>
+          <w:bCs/>
           <w:lang w:val="en-US"/>
         </w:rPr>
         <w:t>Day 07 - Prompt Engineering</w:t>
@@ -37,55 +41,426 @@
           <w:rFonts w:hint="default"/>
           <w:lang w:val="en-US"/>
         </w:rPr>
-        <w:t>--Prompt Engineering</w:t>
-      </w:r>
-    </w:p>
-    <w:p>
-      <w:pPr>
-        <w:rPr>
-          <w:rFonts w:hint="default"/>
-          <w:lang w:val="en-US"/>
-        </w:rPr>
-      </w:pPr>
-      <w:r>
-        <w:rPr>
-          <w:rFonts w:hint="default"/>
-          <w:lang w:val="en-US"/>
-        </w:rPr>
-        <w:t>--Content Engineering</w:t>
-      </w:r>
-    </w:p>
-    <w:p>
-      <w:pPr>
-        <w:rPr>
-          <w:rFonts w:hint="default"/>
-          <w:lang w:val="en-US"/>
-        </w:rPr>
-      </w:pPr>
-      <w:r>
-        <w:rPr>
-          <w:rFonts w:hint="default"/>
-          <w:lang w:val="en-US"/>
-        </w:rPr>
-        <w:t>--Prompt Injection</w:t>
-      </w:r>
-    </w:p>
-    <w:p>
-      <w:pPr>
-        <w:rPr>
-          <w:rFonts w:hint="default"/>
-          <w:lang w:val="en-US"/>
-        </w:rPr>
-      </w:pPr>
-      <w:r>
-        <w:rPr>
-          <w:rFonts w:hint="default"/>
-          <w:lang w:val="en-US"/>
-        </w:rPr>
-        <w:t>--system prompt vs User Prompt</w:t>
+        <w:t>--</w:t>
+      </w:r>
+      <w:r>
+        <w:rPr>
+          <w:rFonts w:hint="default"/>
+          <w:b/>
+          <w:bCs/>
+          <w:lang w:val="en-US"/>
+        </w:rPr>
+        <w:t>Prompt Engineering</w:t>
+      </w:r>
+      <w:r>
+        <w:rPr>
+          <w:rFonts w:hint="default"/>
+          <w:lang w:val="en-US"/>
+        </w:rPr>
+        <w:t xml:space="preserve"> - Communicating between Human &amp; AI</w:t>
+      </w:r>
+    </w:p>
+    <w:p>
+      <w:pPr>
+        <w:rPr>
+          <w:rFonts w:hint="default"/>
+          <w:lang w:val="en-US"/>
+        </w:rPr>
+      </w:pPr>
+      <w:r>
+        <w:rPr>
+          <w:rFonts w:hint="default"/>
+          <w:lang w:val="en-US"/>
+        </w:rPr>
+        <w:t>--</w:t>
+      </w:r>
+      <w:r>
+        <w:rPr>
+          <w:rFonts w:hint="default"/>
+          <w:b/>
+          <w:bCs/>
+          <w:lang w:val="en-US"/>
+        </w:rPr>
+        <w:t>System prompt</w:t>
+      </w:r>
+      <w:r>
+        <w:rPr>
+          <w:rFonts w:hint="default"/>
+          <w:lang w:val="en-US"/>
+        </w:rPr>
+        <w:t xml:space="preserve"> -- One time set up designing how the LLM should behave.</w:t>
+      </w:r>
+      <w:r>
+        <w:rPr>
+          <w:rFonts w:hint="default"/>
+          <w:lang w:val="en-US"/>
+        </w:rPr>
+        <w:tab/>
+      </w:r>
+    </w:p>
+    <w:p>
+      <w:pPr>
+        <w:rPr>
+          <w:rFonts w:hint="default"/>
+          <w:lang w:val="en-US"/>
+        </w:rPr>
+      </w:pPr>
+      <w:r>
+        <w:rPr>
+          <w:rFonts w:hint="default"/>
+          <w:lang w:val="en-US"/>
+        </w:rPr>
+        <w:t>--</w:t>
+      </w:r>
+      <w:r>
+        <w:rPr>
+          <w:rFonts w:hint="default"/>
+          <w:b/>
+          <w:bCs/>
+          <w:lang w:val="en-US"/>
+        </w:rPr>
+        <w:t>User Prompt</w:t>
+      </w:r>
+    </w:p>
+    <w:p>
+      <w:pPr>
+        <w:rPr>
+          <w:rFonts w:hint="default"/>
+          <w:lang w:val="en-US"/>
+        </w:rPr>
+      </w:pPr>
+      <w:r>
+        <w:rPr>
+          <w:rFonts w:hint="default"/>
+          <w:lang w:val="en-US"/>
+        </w:rPr>
+        <w:t>--</w:t>
+      </w:r>
+      <w:r>
+        <w:rPr>
+          <w:rFonts w:hint="default"/>
+          <w:b/>
+          <w:bCs/>
+          <w:lang w:val="en-US"/>
+        </w:rPr>
+        <w:t>Basic Prompting formula RTCFR</w:t>
+      </w:r>
+    </w:p>
+    <w:p>
+      <w:pPr>
+        <w:rPr>
+          <w:rFonts w:hint="default"/>
+          <w:lang w:val="en-US"/>
+        </w:rPr>
+      </w:pPr>
+      <w:r>
+        <w:drawing>
+          <wp:inline distT="0" distB="0" distL="114300" distR="114300">
+            <wp:extent cx="5273040" cy="2341880"/>
+            <wp:effectExtent l="0" t="0" r="3810" b="1270"/>
+            <wp:docPr id="1" name="Picture 1"/>
+            <wp:cNvGraphicFramePr>
+              <a:graphicFrameLocks xmlns:a="http://schemas.openxmlformats.org/drawingml/2006/main" noChangeAspect="1"/>
+            </wp:cNvGraphicFramePr>
+            <a:graphic xmlns:a="http://schemas.openxmlformats.org/drawingml/2006/main">
+              <a:graphicData uri="http://schemas.openxmlformats.org/drawingml/2006/picture">
+                <pic:pic xmlns:pic="http://schemas.openxmlformats.org/drawingml/2006/picture">
+                  <pic:nvPicPr>
+                    <pic:cNvPr id="1" name="Picture 1"/>
+                    <pic:cNvPicPr>
+                      <a:picLocks noChangeAspect="1"/>
+                    </pic:cNvPicPr>
+                  </pic:nvPicPr>
+                  <pic:blipFill>
+                    <a:blip r:embed="rId4"/>
+                    <a:stretch>
+                      <a:fillRect/>
+                    </a:stretch>
+                  </pic:blipFill>
+                  <pic:spPr>
+                    <a:xfrm>
+                      <a:off x="0" y="0"/>
+                      <a:ext cx="5273040" cy="2341880"/>
+                    </a:xfrm>
+                    <a:prstGeom prst="rect">
+                      <a:avLst/>
+                    </a:prstGeom>
+                    <a:noFill/>
+                    <a:ln>
+                      <a:noFill/>
+                    </a:ln>
+                  </pic:spPr>
+                </pic:pic>
+              </a:graphicData>
+            </a:graphic>
+          </wp:inline>
+        </w:drawing>
+      </w:r>
+    </w:p>
+    <w:p>
+      <w:pPr>
+        <w:rPr>
+          <w:rFonts w:hint="default"/>
+          <w:lang w:val="en-US"/>
+        </w:rPr>
+      </w:pPr>
+      <w:r>
+        <w:rPr>
+          <w:rFonts w:hint="default"/>
+          <w:lang w:val="en-US"/>
+        </w:rPr>
+        <w:t>- R stands for Role - Act as a ‘Role’, You are an expertise in ‘Domain’ ‘Skill’ having experience X years</w:t>
+      </w:r>
+    </w:p>
+    <w:p>
+      <w:pPr>
+        <w:rPr>
+          <w:rFonts w:hint="default"/>
+          <w:lang w:val="en-US"/>
+        </w:rPr>
+      </w:pPr>
+      <w:r>
+        <w:rPr>
+          <w:rFonts w:hint="default"/>
+          <w:lang w:val="en-US"/>
+        </w:rPr>
+        <w:t>- T stands for Task - Explain AI what to do clear information</w:t>
+      </w:r>
+    </w:p>
+    <w:p>
+      <w:pPr>
+        <w:rPr>
+          <w:rFonts w:hint="default"/>
+          <w:lang w:val="en-US"/>
+        </w:rPr>
+      </w:pPr>
+      <w:r>
+        <w:rPr>
+          <w:rFonts w:hint="default"/>
+          <w:lang w:val="en-US"/>
+        </w:rPr>
+        <w:t xml:space="preserve">- C stands for Context - Giving the actual Background. Without context AI can only guess. </w:t>
+      </w:r>
+    </w:p>
+    <w:p>
+      <w:pPr>
+        <w:rPr>
+          <w:rFonts w:hint="default"/>
+          <w:lang w:val="en-US"/>
+        </w:rPr>
+      </w:pPr>
+      <w:r>
+        <w:rPr>
+          <w:rFonts w:hint="default"/>
+          <w:lang w:val="en-US"/>
+        </w:rPr>
+        <w:t xml:space="preserve">- F stands for Fewshots - Examples, Pattern </w:t>
+      </w:r>
+    </w:p>
+    <w:p>
+      <w:pPr>
+        <w:rPr>
+          <w:rFonts w:hint="default"/>
+          <w:lang w:val="en-US"/>
+        </w:rPr>
+      </w:pPr>
+      <w:r>
+        <w:rPr>
+          <w:rFonts w:hint="default"/>
+          <w:lang w:val="en-US"/>
+        </w:rPr>
+        <w:t xml:space="preserve">- R stands for Responses - </w:t>
+      </w:r>
+    </w:p>
+    <w:p>
+      <w:pPr>
+        <w:rPr>
+          <w:rFonts w:hint="default"/>
+          <w:lang w:val="en-US"/>
+        </w:rPr>
+      </w:pPr>
+      <w:r>
+        <w:rPr>
+          <w:rFonts w:hint="default"/>
+          <w:b/>
+          <w:bCs/>
+          <w:lang w:val="en-US"/>
+        </w:rPr>
+        <w:t>Tip &amp; Tricks</w:t>
+      </w:r>
+      <w:r>
+        <w:rPr>
+          <w:rFonts w:hint="default"/>
+          <w:lang w:val="en-US"/>
+        </w:rPr>
+        <w:t xml:space="preserve"> using Keyword - Think, Think a lot, Think a more, Ultra think</w:t>
+      </w:r>
+    </w:p>
+    <w:p>
+      <w:pPr>
+        <w:rPr>
+          <w:rFonts w:hint="default"/>
+          <w:b w:val="0"/>
+          <w:bCs w:val="0"/>
+          <w:lang w:val="en-US"/>
+        </w:rPr>
+      </w:pPr>
+      <w:r>
+        <w:rPr>
+          <w:rFonts w:hint="default"/>
+          <w:lang w:val="en-US"/>
+        </w:rPr>
+        <w:t>-</w:t>
+      </w:r>
+      <w:r>
+        <w:rPr>
+          <w:rFonts w:hint="default"/>
+          <w:b/>
+          <w:bCs/>
+          <w:lang w:val="en-US"/>
+        </w:rPr>
+        <w:t xml:space="preserve">Reverse prompting - </w:t>
+      </w:r>
+      <w:r>
+        <w:rPr>
+          <w:rFonts w:hint="default"/>
+          <w:b w:val="0"/>
+          <w:bCs w:val="0"/>
+          <w:lang w:val="en-US"/>
+        </w:rPr>
+        <w:t>Ask Chat GPT, Claude, GROK to give a prompt  in a RTCFR format</w:t>
+      </w:r>
+    </w:p>
+    <w:p>
+      <w:pPr>
+        <w:rPr>
+          <w:rFonts w:hint="default"/>
+          <w:b w:val="0"/>
+          <w:bCs w:val="0"/>
+          <w:lang w:val="en-US"/>
+        </w:rPr>
+      </w:pPr>
+      <w:r>
+        <w:rPr>
+          <w:rFonts w:hint="default"/>
+          <w:b w:val="0"/>
+          <w:bCs w:val="0"/>
+          <w:lang w:val="en-US"/>
+        </w:rPr>
+        <w:t>-</w:t>
+      </w:r>
+      <w:r>
+        <w:rPr>
+          <w:rFonts w:hint="default"/>
+          <w:b/>
+          <w:bCs/>
+          <w:lang w:val="en-US"/>
+        </w:rPr>
+        <w:t>Prompt chaining</w:t>
+      </w:r>
+      <w:r>
+        <w:rPr>
+          <w:rFonts w:hint="default"/>
+          <w:b w:val="0"/>
+          <w:bCs w:val="0"/>
+          <w:lang w:val="en-US"/>
+        </w:rPr>
+        <w:t>- Sequential chaining, COT ( Chain of thoughts ) - Think step by step, TOT, ReACT</w:t>
+      </w:r>
+    </w:p>
+    <w:p>
+      <w:pPr>
+        <w:rPr>
+          <w:rFonts w:hint="default"/>
+          <w:b/>
+          <w:bCs/>
+          <w:lang w:val="en-US"/>
+        </w:rPr>
+      </w:pPr>
+      <w:r>
+        <w:rPr>
+          <w:rFonts w:hint="default"/>
+          <w:b w:val="0"/>
+          <w:bCs w:val="0"/>
+          <w:lang w:val="en-US"/>
+        </w:rPr>
+        <w:t>-</w:t>
+      </w:r>
+      <w:r>
+        <w:rPr>
+          <w:rFonts w:hint="default"/>
+          <w:b/>
+          <w:bCs/>
+          <w:lang w:val="en-US"/>
+        </w:rPr>
+        <w:t>Advance Prompting</w:t>
+      </w:r>
+    </w:p>
+    <w:p>
+      <w:pPr>
+        <w:rPr>
+          <w:rFonts w:hint="default"/>
+          <w:lang w:val="en-US"/>
+        </w:rPr>
+      </w:pPr>
+      <w:r>
+        <w:rPr>
+          <w:rFonts w:hint="default"/>
+          <w:b/>
+          <w:bCs/>
+          <w:lang w:val="en-US"/>
+        </w:rPr>
+        <w:t>-Keywords of Prompting</w:t>
+      </w:r>
+    </w:p>
+    <w:p>
+      <w:pPr>
+        <w:rPr>
+          <w:rFonts w:hint="default"/>
+          <w:lang w:val="en-US"/>
+        </w:rPr>
+      </w:pPr>
+      <w:r>
+        <w:rPr>
+          <w:rFonts w:hint="default"/>
+          <w:lang w:val="en-US"/>
+        </w:rPr>
+        <w:t>--</w:t>
+      </w:r>
+      <w:r>
+        <w:rPr>
+          <w:rFonts w:hint="default"/>
+          <w:b/>
+          <w:bCs/>
+          <w:lang w:val="en-US"/>
+        </w:rPr>
+        <w:t xml:space="preserve">Prompt Injection -  </w:t>
       </w:r>
       <w:bookmarkStart w:id="0" w:name="_GoBack"/>
       <w:bookmarkEnd w:id="0"/>
+    </w:p>
+    <w:p>
+      <w:pPr>
+        <w:rPr>
+          <w:rFonts w:hint="default"/>
+          <w:lang w:val="en-US"/>
+        </w:rPr>
+      </w:pPr>
+      <w:r>
+        <w:rPr>
+          <w:rFonts w:hint="default"/>
+          <w:lang w:val="en-US"/>
+        </w:rPr>
+        <w:t>--</w:t>
+      </w:r>
+    </w:p>
+    <w:p>
+      <w:pPr>
+        <w:rPr>
+          <w:rFonts w:hint="default"/>
+          <w:lang w:val="en-US"/>
+        </w:rPr>
+      </w:pPr>
     </w:p>
     <w:sectPr>
       <w:pgSz w:w="11906" w:h="16838"/>
@@ -173,7 +548,7 @@
     <w:lsdException w:qFormat="1" w:unhideWhenUsed="0" w:uiPriority="0" w:semiHidden="0" w:name="Title"/>
     <w:lsdException w:unhideWhenUsed="0" w:uiPriority="0" w:semiHidden="0" w:name="Closing"/>
     <w:lsdException w:unhideWhenUsed="0" w:uiPriority="0" w:semiHidden="0" w:name="Signature"/>
-    <w:lsdException w:unhideWhenUsed="0" w:uiPriority="0" w:name="Default Paragraph Font"/>
+    <w:lsdException w:qFormat="1" w:unhideWhenUsed="0" w:uiPriority="0" w:name="Default Paragraph Font"/>
     <w:lsdException w:unhideWhenUsed="0" w:uiPriority="0" w:semiHidden="0" w:name="Body Text"/>
     <w:lsdException w:unhideWhenUsed="0" w:uiPriority="0" w:semiHidden="0" w:name="Body Text Indent"/>
     <w:lsdException w:unhideWhenUsed="0" w:uiPriority="0" w:semiHidden="0" w:name="List Continue"/>
@@ -369,6 +744,7 @@
   <w:style w:type="character" w:default="1" w:styleId="2">
     <w:name w:val="Default Paragraph Font"/>
     <w:semiHidden/>
+    <w:qFormat/>
     <w:uiPriority w:val="0"/>
   </w:style>
   <w:style w:type="table" w:default="1" w:styleId="3">

</xml_diff>